<commit_message>
feat: implement HTML-to-DOCX conversion logic using python-docx and BeautifulSoup
</commit_message>
<xml_diff>
--- a/assets/test_sesion_compilada.docx
+++ b/assets/test_sesion_compilada.docx
@@ -41,7 +41,7 @@
                 <w:color w:val="FFFFFF"/>
                 <w:sz w:val="23"/>
               </w:rPr>
-              <w:t>SESIÓN DE APRENDIZAJE N° Sesion 01</w:t>
+              <w:t>SESIÓN DE APRENDIZAJE N° 01</w:t>
             </w:r>
           </w:p>
         </w:tc>
@@ -592,7 +592,7 @@
               <w:rPr>
                 <w:sz w:val="19"/>
               </w:rPr>
-              <w:t>Hoy aprenderemos a identificar y operar con fracciones equivalentes para resolver situaciones reales.</w:t>
+              <w:t>Hoy aprenderemos a identificar y operar con fracciones equivalentes.</w:t>
             </w:r>
           </w:p>
         </w:tc>
@@ -642,7 +642,7 @@
               <w:rPr>
                 <w:sz w:val="19"/>
               </w:rPr>
-              <w:t>Concepto de fraccion, equivalencia, simplificacion y amplificacion de fracciones.</w:t>
+              <w:t>Fracciones equivalentes, simplificacion.</w:t>
             </w:r>
           </w:p>
         </w:tc>
@@ -762,7 +762,7 @@
               <w:rPr>
                 <w:sz w:val="19"/>
               </w:rPr>
-              <w:t>Resuelve problemas referidos a relaciones entre cantidades y magnitudes.</w:t>
+              <w:t>Resuelve problemas referidos a relaciones entre cantidades.</w:t>
             </w:r>
           </w:p>
         </w:tc>
@@ -942,25 +942,7 @@
               <w:rPr>
                 <w:sz w:val="18"/>
               </w:rPr>
-              <w:t>Traduce cantidades a expresiones numericas.</w:t>
-            </w:r>
-          </w:p>
-          <w:p>
-            <w:pPr>
-              <w:spacing w:after="40"/>
-            </w:pPr>
-            <w:r>
-              <w:rPr>
-                <w:color w:val="C0392B"/>
-                <w:sz w:val="18"/>
-              </w:rPr>
-              <w:t xml:space="preserve">● </w:t>
-            </w:r>
-            <w:r>
-              <w:rPr>
-                <w:sz w:val="18"/>
-              </w:rPr>
-              <w:t>Comunica su comprension sobre los numeros.</w:t>
+              <w:t>Traduce cantidades.</w:t>
             </w:r>
           </w:p>
         </w:tc>
@@ -992,25 +974,7 @@
               <w:rPr>
                 <w:sz w:val="18"/>
               </w:rPr>
-              <w:t>Reconoce si dos o mas fracciones representan la misma cantidad.</w:t>
-            </w:r>
-          </w:p>
-          <w:p>
-            <w:pPr>
-              <w:spacing w:after="40"/>
-            </w:pPr>
-            <w:r>
-              <w:rPr>
-                <w:color w:val="C0392B"/>
-                <w:sz w:val="18"/>
-              </w:rPr>
-              <w:t xml:space="preserve">● </w:t>
-            </w:r>
-            <w:r>
-              <w:rPr>
-                <w:sz w:val="18"/>
-              </w:rPr>
-              <w:t>Emplea estrategias de amplificacion/simplificacion.</w:t>
+              <w:t>Reconoce si dos fracciones son equivalentes.</w:t>
             </w:r>
           </w:p>
         </w:tc>
@@ -1032,7 +996,7 @@
               <w:rPr>
                 <w:sz w:val="17"/>
               </w:rPr>
-              <w:t>Ficha practica de resolucion de ejercicios cotidianos.</w:t>
+              <w:t>Ficha practica.</w:t>
             </w:r>
           </w:p>
         </w:tc>
@@ -1241,6 +1205,42 @@
               <w:t>Define metas de aprendizaje para alcanzar sus objetivos pedagógicos.</w:t>
             </w:r>
           </w:p>
+          <w:p>
+            <w:pPr>
+              <w:spacing w:after="40"/>
+            </w:pPr>
+            <w:r>
+              <w:rPr>
+                <w:color w:val="C0392B"/>
+                <w:sz w:val="18"/>
+              </w:rPr>
+              <w:t xml:space="preserve">● </w:t>
+            </w:r>
+            <w:r>
+              <w:rPr>
+                <w:sz w:val="18"/>
+              </w:rPr>
+              <w:t>Organiza acciones estrategicas para alcanzar sus metas de aprendizaje.</w:t>
+            </w:r>
+          </w:p>
+          <w:p>
+            <w:pPr>
+              <w:spacing w:after="40"/>
+            </w:pPr>
+            <w:r>
+              <w:rPr>
+                <w:color w:val="27AE60"/>
+                <w:sz w:val="18"/>
+              </w:rPr>
+              <w:t xml:space="preserve">● </w:t>
+            </w:r>
+            <w:r>
+              <w:rPr>
+                <w:sz w:val="18"/>
+              </w:rPr>
+              <w:t>Monitorea y ajusta su desempeno durante el proceso de aprendizaje.</w:t>
+            </w:r>
+          </w:p>
         </w:tc>
       </w:tr>
       <w:tr>
@@ -1260,7 +1260,7 @@
               <w:rPr>
                 <w:sz w:val="17"/>
               </w:rPr>
-              <w:t>Se desenvuelve en entornos virtuales generados por las TIC</w:t>
+              <w:t>Se desenvuelve en los entornos virtuales generados por las TIC</w:t>
             </w:r>
           </w:p>
         </w:tc>
@@ -1292,7 +1292,43 @@
               <w:rPr>
                 <w:sz w:val="18"/>
               </w:rPr>
-              <w:t>Crea objetos virtuales en diversos formatos.</w:t>
+              <w:t>Personaliza entornos virtuales segun sus necesidades de indagacion.</w:t>
+            </w:r>
+          </w:p>
+          <w:p>
+            <w:pPr>
+              <w:spacing w:after="40"/>
+            </w:pPr>
+            <w:r>
+              <w:rPr>
+                <w:color w:val="C0392B"/>
+                <w:sz w:val="18"/>
+              </w:rPr>
+              <w:t xml:space="preserve">● </w:t>
+            </w:r>
+            <w:r>
+              <w:rPr>
+                <w:sz w:val="18"/>
+              </w:rPr>
+              <w:t>Gestiona informacion del entorno virtual de manera segura.</w:t>
+            </w:r>
+          </w:p>
+          <w:p>
+            <w:pPr>
+              <w:spacing w:after="40"/>
+            </w:pPr>
+            <w:r>
+              <w:rPr>
+                <w:color w:val="27AE60"/>
+                <w:sz w:val="18"/>
+              </w:rPr>
+              <w:t xml:space="preserve">● </w:t>
+            </w:r>
+            <w:r>
+              <w:rPr>
+                <w:sz w:val="18"/>
+              </w:rPr>
+              <w:t>Interactua en entornos virtuales y crea objetos virtuales.</w:t>
             </w:r>
           </w:p>
         </w:tc>
@@ -1585,7 +1621,7 @@
               <w:rPr>
                 <w:sz w:val="17"/>
               </w:rPr>
-              <w:t>https://www.perueduca.pe/</w:t>
+              <w:t>https://www.perueduca.pe/#/home/materiales-educativos</w:t>
             </w:r>
           </w:p>
         </w:tc>
@@ -1669,7 +1705,7 @@
               <w:rPr>
                 <w:sz w:val="17"/>
               </w:rPr>
-              <w:t>Cuaderno de trabajo, fichas de actividades, pizarra, plumones.</w:t>
+              <w:t>Ficha de actividades N° 01-02</w:t>
             </w:r>
           </w:p>
         </w:tc>
@@ -1715,7 +1751,6 @@
               <w:rPr>
                 <w:sz w:val="17"/>
               </w:rPr>
-              <w:t>Ficha de Refuerzo N 01: Operaciones con fracciones.</w:t>
             </w:r>
           </w:p>
         </w:tc>
@@ -1924,29 +1959,7 @@
               <w:rPr>
                 <w:sz w:val="19"/>
               </w:rPr>
-              <w:t>El docente saluda, establece acuerdos de convivencia.</w:t>
-            </w:r>
-          </w:p>
-          <w:p>
-            <w:pPr>
-              <w:spacing w:after="80" w:line="276" w:lineRule="auto"/>
-            </w:pPr>
-            <w:r>
-              <w:rPr>
-                <w:sz w:val="19"/>
-              </w:rPr>
-              <w:t>Presenta una situacion problematica: dividir un pastel.</w:t>
-            </w:r>
-          </w:p>
-          <w:p>
-            <w:pPr>
-              <w:spacing w:after="80" w:line="276" w:lineRule="auto"/>
-            </w:pPr>
-            <w:r>
-              <w:rPr>
-                <w:sz w:val="19"/>
-              </w:rPr>
-              <w:t>Recoge saberes previos sobre que representa la mitad.</w:t>
+              <w:t>El docente saluda, establece acuerdos.</w:t>
             </w:r>
           </w:p>
         </w:tc>
@@ -2010,7 +2023,6 @@
         <w:tc>
           <w:tcPr>
             <w:tcW w:type="dxa" w:w="1728"/>
-            <w:vMerge w:val="restart"/>
             <w:shd w:val="clear" w:color="auto" w:fill="EDEDED"/>
             <w:tcMar>
               <w:top w:w="120" w:type="dxa"/>
@@ -2059,7 +2071,6 @@
         <w:tc>
           <w:tcPr>
             <w:tcW w:type="dxa" w:w="504"/>
-            <w:vMerge w:val="restart"/>
             <w:shd w:val="clear" w:color="auto" w:fill="FBE5D5"/>
             <w:tcMar>
               <w:top w:w="120" w:type="dxa"/>
@@ -2068,49 +2079,6 @@
               <w:right w:w="40" w:type="dxa"/>
             </w:tcMar>
           </w:tcPr>
-          <w:p>
-            <w:pPr>
-              <w:spacing w:line="240" w:lineRule="auto" w:after="0"/>
-              <w:jc w:val="center"/>
-            </w:pPr>
-            <w:r>
-              <w:rPr>
-                <w:b/>
-                <w:color w:val="783C14"/>
-                <w:sz w:val="17"/>
-              </w:rPr>
-              <w:br/>
-              <w:t>M</w:t>
-              <w:br/>
-              <w:br/>
-              <w:t>O</w:t>
-              <w:br/>
-              <w:br/>
-              <w:t>T</w:t>
-              <w:br/>
-              <w:br/>
-              <w:t>I</w:t>
-              <w:br/>
-              <w:br/>
-              <w:t>V</w:t>
-              <w:br/>
-              <w:br/>
-              <w:t>A</w:t>
-              <w:br/>
-              <w:br/>
-              <w:t>C</w:t>
-              <w:br/>
-              <w:br/>
-              <w:t>I</w:t>
-              <w:br/>
-              <w:br/>
-              <w:t>O</w:t>
-              <w:br/>
-              <w:br/>
-              <w:t>N</w:t>
-              <w:br/>
-            </w:r>
-          </w:p>
           <w:p>
             <w:pPr>
               <w:spacing w:line="240" w:lineRule="auto" w:after="0"/>
@@ -2189,25 +2157,13 @@
               <w:rPr>
                 <w:sz w:val="19"/>
               </w:rPr>
-              <w:t>Los estudiantes leen la situacion de forma individual.</w:t>
-            </w:r>
-          </w:p>
-          <w:p>
-            <w:pPr>
-              <w:spacing w:after="80" w:line="276" w:lineRule="auto"/>
-            </w:pPr>
-            <w:r>
-              <w:rPr>
-                <w:sz w:val="19"/>
-              </w:rPr>
-              <w:t>El docente plantea preguntas de comprension.</w:t>
+              <w:t>Los estudiantes leen la situacion.</w:t>
             </w:r>
           </w:p>
         </w:tc>
         <w:tc>
           <w:tcPr>
             <w:tcW w:type="dxa" w:w="504"/>
-            <w:vMerge w:val="restart"/>
             <w:shd w:val="clear" w:color="auto" w:fill="FBE5D5"/>
             <w:tcMar>
               <w:top w:w="120" w:type="dxa"/>
@@ -2259,135 +2215,6 @@
               <w:br/>
             </w:r>
           </w:p>
-          <w:p>
-            <w:pPr>
-              <w:spacing w:line="240" w:lineRule="auto" w:after="0"/>
-              <w:jc w:val="center"/>
-            </w:pPr>
-            <w:r>
-              <w:rPr>
-                <w:b/>
-                <w:color w:val="783C14"/>
-                <w:sz w:val="17"/>
-              </w:rPr>
-              <w:br/>
-              <w:t>E</w:t>
-              <w:br/>
-              <w:br/>
-              <w:t>V</w:t>
-              <w:br/>
-              <w:br/>
-              <w:t>A</w:t>
-              <w:br/>
-              <w:br/>
-              <w:t>L</w:t>
-              <w:br/>
-              <w:br/>
-              <w:t>U</w:t>
-              <w:br/>
-              <w:br/>
-              <w:t>A</w:t>
-              <w:br/>
-              <w:br/>
-              <w:t>C</w:t>
-              <w:br/>
-              <w:br/>
-              <w:t>I</w:t>
-              <w:br/>
-              <w:br/>
-              <w:t>O</w:t>
-              <w:br/>
-              <w:br/>
-              <w:t>N</w:t>
-              <w:br/>
-            </w:r>
-          </w:p>
-        </w:tc>
-      </w:tr>
-      <w:tr>
-        <w:tc>
-          <w:tcPr>
-            <w:tcW w:type="dxa" w:w="2437"/>
-            <w:vMerge/>
-          </w:tcPr>
-          <w:p/>
-        </w:tc>
-        <w:tc>
-          <w:tcPr>
-            <w:tcW w:type="dxa" w:w="2437"/>
-            <w:vMerge/>
-            <w:shd w:val="clear" w:color="auto" w:fill="FBE5D5"/>
-            <w:tcMar>
-              <w:top w:w="120" w:type="dxa"/>
-              <w:bottom w:w="120" w:type="dxa"/>
-              <w:left w:w="40" w:type="dxa"/>
-              <w:right w:w="40" w:type="dxa"/>
-            </w:tcMar>
-          </w:tcPr>
-          <w:p/>
-        </w:tc>
-        <w:tc>
-          <w:tcPr>
-            <w:tcW w:type="dxa" w:w="7013"/>
-            <w:tcMar>
-              <w:top w:w="120" w:type="dxa"/>
-              <w:bottom w:w="120" w:type="dxa"/>
-              <w:left w:w="140" w:type="dxa"/>
-              <w:right w:w="140" w:type="dxa"/>
-            </w:tcMar>
-          </w:tcPr>
-          <w:p>
-            <w:r/>
-          </w:p>
-          <w:p>
-            <w:pPr>
-              <w:spacing w:after="80"/>
-            </w:pPr>
-            <w:r>
-              <w:rPr>
-                <w:b/>
-                <w:color w:val="C0392B"/>
-                <w:sz w:val="19"/>
-              </w:rPr>
-              <w:t>BUSQUEDA DE ESTRATEGIAS</w:t>
-            </w:r>
-          </w:p>
-          <w:p>
-            <w:pPr>
-              <w:spacing w:after="80" w:line="276" w:lineRule="auto"/>
-            </w:pPr>
-            <w:r>
-              <w:rPr>
-                <w:sz w:val="19"/>
-              </w:rPr>
-              <w:t>Los alumnos se organizan en grupos de trabajo.</w:t>
-            </w:r>
-          </w:p>
-          <w:p>
-            <w:pPr>
-              <w:spacing w:after="80" w:line="276" w:lineRule="auto"/>
-            </w:pPr>
-            <w:r>
-              <w:rPr>
-                <w:sz w:val="19"/>
-              </w:rPr>
-              <w:t>Utilizan material concreto (tiras de fracciones) para experimentar.</w:t>
-            </w:r>
-          </w:p>
-        </w:tc>
-        <w:tc>
-          <w:tcPr>
-            <w:tcW w:type="dxa" w:w="2437"/>
-            <w:vMerge/>
-            <w:shd w:val="clear" w:color="auto" w:fill="FBE5D5"/>
-            <w:tcMar>
-              <w:top w:w="120" w:type="dxa"/>
-              <w:bottom w:w="120" w:type="dxa"/>
-              <w:left w:w="40" w:type="dxa"/>
-              <w:right w:w="40" w:type="dxa"/>
-            </w:tcMar>
-          </w:tcPr>
-          <w:p/>
         </w:tc>
       </w:tr>
       <w:tr>
@@ -2525,19 +2352,7 @@
               <w:rPr>
                 <w:sz w:val="19"/>
               </w:rPr>
-              <w:t>Que aprendimos el dia de hoy?</w:t>
-            </w:r>
-          </w:p>
-          <w:p>
-            <w:pPr>
-              <w:pStyle w:val="ListBullet"/>
-              <w:spacing w:after="40"/>
-            </w:pPr>
-            <w:r>
-              <w:rPr>
-                <w:sz w:val="19"/>
-              </w:rPr>
-              <w:t>Tuvimos alguna dificultad? Como la superamos?</w:t>
+              <w:t>Que aprendimos?</w:t>
             </w:r>
           </w:p>
           <w:p>
@@ -2561,19 +2376,7 @@
               <w:rPr>
                 <w:sz w:val="19"/>
               </w:rPr>
-              <w:t>El docente revisa las fichas de trabajo individualmente.</w:t>
-            </w:r>
-          </w:p>
-          <w:p>
-            <w:pPr>
-              <w:pStyle w:val="ListBullet"/>
-              <w:spacing w:after="40"/>
-            </w:pPr>
-            <w:r>
-              <w:rPr>
-                <w:sz w:val="19"/>
-              </w:rPr>
-              <w:t>Brinda retroalimentacion constructiva.</w:t>
+              <w:t>Revisión de fichas.</w:t>
             </w:r>
           </w:p>
           <w:p>
@@ -2597,7 +2400,7 @@
               <w:rPr>
                 <w:sz w:val="19"/>
               </w:rPr>
-              <w:t>Resolver los ejercicios de la pagina 45 del cuaderno de trabajo.</w:t>
+              <w:t>Resolver la pag 45.</w:t>
             </w:r>
           </w:p>
         </w:tc>
@@ -2754,944 +2557,10 @@
         </w:tc>
       </w:tr>
     </w:tbl>
-    <w:p>
-      <w:r>
-        <w:br w:type="page"/>
-      </w:r>
-    </w:p>
-    <w:p>
-      <w:pPr>
-        <w:sectPr>
-          <w:headerReference w:type="default" r:id="rId9"/>
-          <w:pgSz w:w="11909" w:h="16834"/>
-          <w:pgMar w:top="144" w:right="1080" w:bottom="144" w:left="1080" w:header="720" w:footer="720" w:gutter="0"/>
-          <w:cols w:space="720"/>
-          <w:docGrid w:linePitch="360"/>
-        </w:sectPr>
-      </w:pPr>
-    </w:p>
-    <w:tbl>
-      <w:tblPr>
-        <w:tblW w:type="auto" w:w="0"/>
-        <w:tblLayout w:type="fixed"/>
-        <w:tblLook w:firstColumn="1" w:firstRow="1" w:lastColumn="0" w:lastRow="0" w:noHBand="0" w:noVBand="1" w:val="04A0"/>
-        <w:tblBorders>
-          <w:top w:val="single" w:sz="8" w:space="0" w:color="000000"/>
-          <w:left w:val="single" w:sz="8" w:space="0" w:color="000000"/>
-          <w:bottom w:val="single" w:sz="8" w:space="0" w:color="000000"/>
-          <w:right w:val="single" w:sz="8" w:space="0" w:color="000000"/>
-          <w:insideH w:val="single" w:sz="8" w:space="0" w:color="000000"/>
-          <w:insideV w:val="single" w:sz="8" w:space="0" w:color="000000"/>
-        </w:tblBorders>
-      </w:tblPr>
-      <w:tblGrid>
-        <w:gridCol w:w="9605"/>
-      </w:tblGrid>
-      <w:tr>
-        <w:tc>
-          <w:tcPr>
-            <w:tcW w:type="dxa" w:w="9605"/>
-            <w:shd w:val="clear" w:color="auto" w:fill="2980B9"/>
-            <w:tcMar>
-              <w:top w:w="120" w:type="dxa"/>
-              <w:bottom w:w="120" w:type="dxa"/>
-              <w:left w:w="180" w:type="dxa"/>
-              <w:right w:w="180" w:type="dxa"/>
-            </w:tcMar>
-          </w:tcPr>
-          <w:p>
-            <w:pPr>
-              <w:jc w:val="center"/>
-            </w:pPr>
-            <w:r>
-              <w:rPr>
-                <w:b/>
-                <w:color w:val="FFFFFF"/>
-                <w:sz w:val="23"/>
-              </w:rPr>
-              <w:t>FICHA DE TRABAJO DE APRENDIZAJE INDEPENDIENTE</w:t>
-            </w:r>
-          </w:p>
-        </w:tc>
-      </w:tr>
-    </w:tbl>
-    <w:p>
-      <w:pPr>
-        <w:spacing w:before="200"/>
-      </w:pPr>
-    </w:p>
-    <w:tbl>
-      <w:tblPr>
-        <w:tblW w:type="auto" w:w="0"/>
-        <w:tblLayout w:type="fixed"/>
-        <w:tblLook w:firstColumn="1" w:firstRow="1" w:lastColumn="0" w:lastRow="0" w:noHBand="0" w:noVBand="1" w:val="04A0"/>
-        <w:tblBorders>
-          <w:top w:val="single" w:sz="4" w:space="0" w:color="CBD5E1"/>
-          <w:left w:val="single" w:sz="4" w:space="0" w:color="CBD5E1"/>
-          <w:bottom w:val="single" w:sz="4" w:space="0" w:color="CBD5E1"/>
-          <w:right w:val="single" w:sz="4" w:space="0" w:color="CBD5E1"/>
-          <w:insideH w:val="single" w:sz="4" w:space="0" w:color="CBD5E1"/>
-          <w:insideV w:val="single" w:sz="4" w:space="0" w:color="CBD5E1"/>
-        </w:tblBorders>
-      </w:tblPr>
-      <w:tblGrid>
-        <w:gridCol w:w="4802"/>
-        <w:gridCol w:w="4802"/>
-      </w:tblGrid>
-      <w:tr>
-        <w:tc>
-          <w:tcPr>
-            <w:tcW w:type="dxa" w:w="6480"/>
-            <w:tcMar>
-              <w:top w:w="80" w:type="dxa"/>
-              <w:bottom w:w="80" w:type="dxa"/>
-              <w:left w:w="120" w:type="dxa"/>
-              <w:right w:w="120" w:type="dxa"/>
-            </w:tcMar>
-          </w:tcPr>
-          <w:p>
-            <w:r>
-              <w:rPr>
-                <w:b/>
-                <w:sz w:val="19"/>
-              </w:rPr>
-              <w:t>Estudiante: __________________________________________________</w:t>
-            </w:r>
-          </w:p>
-        </w:tc>
-        <w:tc>
-          <w:tcPr>
-            <w:tcW w:type="dxa" w:w="3125"/>
-            <w:tcMar>
-              <w:top w:w="80" w:type="dxa"/>
-              <w:bottom w:w="80" w:type="dxa"/>
-              <w:left w:w="120" w:type="dxa"/>
-              <w:right w:w="120" w:type="dxa"/>
-            </w:tcMar>
-          </w:tcPr>
-          <w:p>
-            <w:pPr>
-              <w:jc w:val="right"/>
-            </w:pPr>
-            <w:r>
-              <w:rPr>
-                <w:b/>
-                <w:sz w:val="19"/>
-              </w:rPr>
-              <w:t>Grado y Sección: ________________</w:t>
-            </w:r>
-          </w:p>
-        </w:tc>
-      </w:tr>
-    </w:tbl>
-    <w:p>
-      <w:pPr>
-        <w:spacing w:before="160"/>
-      </w:pPr>
-    </w:p>
-    <w:p>
-      <w:pPr>
-        <w:spacing w:after="80"/>
-      </w:pPr>
-      <w:r>
-        <w:rPr>
-          <w:b/>
-          <w:color w:val="2980B9"/>
-          <w:sz w:val="24"/>
-        </w:rPr>
-        <w:t>Actividad: FICHA DE TRABAJO N 01: FRACCIONES EQUIVALENTES</w:t>
-      </w:r>
-    </w:p>
-    <w:p>
-      <w:pPr>
-        <w:spacing w:after="240" w:line="276" w:lineRule="auto"/>
-      </w:pPr>
-      <w:r>
-        <w:rPr>
-          <w:b/>
-          <w:sz w:val="19"/>
-        </w:rPr>
-        <w:t xml:space="preserve">Indicaciones: </w:t>
-      </w:r>
-      <w:r>
-        <w:rPr>
-          <w:i/>
-          <w:sz w:val="19"/>
-        </w:rPr>
-        <w:t>Lee detenidamente cada problema y utiliza tu material concreto si es necesario.</w:t>
-      </w:r>
-    </w:p>
-    <w:p>
-      <w:r>
-        <w:br w:type="page"/>
-      </w:r>
-    </w:p>
-    <w:p>
-      <w:pPr>
-        <w:sectPr>
-          <w:pgSz w:w="11909" w:h="16834"/>
-          <w:pgMar w:top="1152" w:right="1152" w:bottom="1152" w:left="1152" w:header="720" w:footer="720" w:gutter="0"/>
-          <w:cols w:space="720"/>
-          <w:docGrid w:linePitch="360"/>
-        </w:sectPr>
-      </w:pPr>
-    </w:p>
-    <w:tbl>
-      <w:tblPr>
-        <w:tblW w:type="auto" w:w="0"/>
-        <w:tblLayout w:type="fixed"/>
-        <w:tblLook w:firstColumn="1" w:firstRow="1" w:lastColumn="0" w:lastRow="0" w:noHBand="0" w:noVBand="1" w:val="04A0"/>
-        <w:tblBorders>
-          <w:top w:val="single" w:sz="8" w:space="0" w:color="000000"/>
-          <w:left w:val="single" w:sz="8" w:space="0" w:color="000000"/>
-          <w:bottom w:val="single" w:sz="8" w:space="0" w:color="000000"/>
-          <w:right w:val="single" w:sz="8" w:space="0" w:color="000000"/>
-          <w:insideH w:val="single" w:sz="8" w:space="0" w:color="000000"/>
-          <w:insideV w:val="single" w:sz="8" w:space="0" w:color="000000"/>
-        </w:tblBorders>
-      </w:tblPr>
-      <w:tblGrid>
-        <w:gridCol w:w="15106"/>
-      </w:tblGrid>
-      <w:tr>
-        <w:tc>
-          <w:tcPr>
-            <w:tcW w:type="dxa" w:w="15106"/>
-            <w:shd w:val="clear" w:color="auto" w:fill="2C3E50"/>
-            <w:tcMar>
-              <w:top w:w="120" w:type="dxa"/>
-              <w:bottom w:w="120" w:type="dxa"/>
-              <w:left w:w="180" w:type="dxa"/>
-              <w:right w:w="180" w:type="dxa"/>
-            </w:tcMar>
-          </w:tcPr>
-          <w:p>
-            <w:pPr>
-              <w:jc w:val="center"/>
-            </w:pPr>
-            <w:r>
-              <w:rPr>
-                <w:b/>
-                <w:color w:val="FFFFFF"/>
-                <w:sz w:val="24"/>
-              </w:rPr>
-              <w:t>LISTA DE COTEJO DE EVALUACION FORMATIVA</w:t>
-            </w:r>
-          </w:p>
-        </w:tc>
-      </w:tr>
-    </w:tbl>
-    <w:p>
-      <w:pPr>
-        <w:spacing w:before="160"/>
-      </w:pPr>
-    </w:p>
-    <w:tbl>
-      <w:tblPr>
-        <w:tblW w:type="auto" w:w="0"/>
-        <w:tblLayout w:type="fixed"/>
-        <w:tblLook w:firstColumn="1" w:firstRow="1" w:lastColumn="0" w:lastRow="0" w:noHBand="0" w:noVBand="1" w:val="04A0"/>
-        <w:tblBorders>
-          <w:top w:val="single" w:sz="8" w:space="0" w:color="000000"/>
-          <w:left w:val="single" w:sz="8" w:space="0" w:color="000000"/>
-          <w:bottom w:val="single" w:sz="8" w:space="0" w:color="000000"/>
-          <w:right w:val="single" w:sz="8" w:space="0" w:color="000000"/>
-          <w:insideH w:val="single" w:sz="8" w:space="0" w:color="000000"/>
-          <w:insideV w:val="single" w:sz="8" w:space="0" w:color="000000"/>
-        </w:tblBorders>
-      </w:tblPr>
-      <w:tblGrid>
-        <w:gridCol w:w="3776"/>
-        <w:gridCol w:w="3776"/>
-        <w:gridCol w:w="3776"/>
-        <w:gridCol w:w="3776"/>
-      </w:tblGrid>
-      <w:tr>
-        <w:tc>
-          <w:tcPr>
-            <w:tcW w:type="dxa" w:w="2160"/>
-            <w:shd w:val="clear" w:color="auto" w:fill="F7CAAC"/>
-            <w:tcMar>
-              <w:top w:w="60" w:type="dxa"/>
-              <w:bottom w:w="60" w:type="dxa"/>
-              <w:left w:w="100" w:type="dxa"/>
-              <w:right w:w="100" w:type="dxa"/>
-            </w:tcMar>
-          </w:tcPr>
-          <w:p>
-            <w:pPr>
-              <w:spacing w:line="264" w:lineRule="auto"/>
-            </w:pPr>
-            <w:r>
-              <w:rPr>
-                <w:b/>
-                <w:sz w:val="18"/>
-              </w:rPr>
-              <w:t>IE / Area</w:t>
-            </w:r>
-          </w:p>
-        </w:tc>
-        <w:tc>
-          <w:tcPr>
-            <w:tcW w:type="dxa" w:w="6480"/>
-            <w:shd w:val="clear" w:color="auto" w:fill="F2F2F2"/>
-            <w:tcMar>
-              <w:top w:w="60" w:type="dxa"/>
-              <w:bottom w:w="60" w:type="dxa"/>
-              <w:left w:w="100" w:type="dxa"/>
-              <w:right w:w="100" w:type="dxa"/>
-            </w:tcMar>
-          </w:tcPr>
-          <w:p>
-            <w:pPr>
-              <w:spacing w:line="264" w:lineRule="auto"/>
-            </w:pPr>
-            <w:r>
-              <w:rPr>
-                <w:sz w:val="18"/>
-              </w:rPr>
-              <w:t>IE Monte Alegre JEC / Matematica</w:t>
-            </w:r>
-          </w:p>
-        </w:tc>
-        <w:tc>
-          <w:tcPr>
-            <w:tcW w:type="dxa" w:w="2160"/>
-            <w:shd w:val="clear" w:color="auto" w:fill="F7CAAC"/>
-            <w:tcMar>
-              <w:top w:w="60" w:type="dxa"/>
-              <w:bottom w:w="60" w:type="dxa"/>
-              <w:left w:w="100" w:type="dxa"/>
-              <w:right w:w="100" w:type="dxa"/>
-            </w:tcMar>
-          </w:tcPr>
-          <w:p>
-            <w:pPr>
-              <w:spacing w:line="264" w:lineRule="auto"/>
-            </w:pPr>
-            <w:r>
-              <w:rPr>
-                <w:b/>
-                <w:sz w:val="18"/>
-              </w:rPr>
-              <w:t>Grado / Seccion</w:t>
-            </w:r>
-          </w:p>
-        </w:tc>
-        <w:tc>
-          <w:tcPr>
-            <w:tcW w:type="dxa" w:w="4306"/>
-            <w:shd w:val="clear" w:color="auto" w:fill="F2F2F2"/>
-            <w:tcMar>
-              <w:top w:w="60" w:type="dxa"/>
-              <w:bottom w:w="60" w:type="dxa"/>
-              <w:left w:w="100" w:type="dxa"/>
-              <w:right w:w="100" w:type="dxa"/>
-            </w:tcMar>
-          </w:tcPr>
-          <w:p>
-            <w:pPr>
-              <w:spacing w:line="264" w:lineRule="auto"/>
-            </w:pPr>
-            <w:r>
-              <w:rPr>
-                <w:sz w:val="18"/>
-              </w:rPr>
-              <w:t>4to de Secundaria "B"</w:t>
-            </w:r>
-          </w:p>
-        </w:tc>
-      </w:tr>
-    </w:tbl>
-    <w:p>
-      <w:pPr>
-        <w:spacing w:before="160"/>
-      </w:pPr>
-    </w:p>
-    <w:tbl>
-      <w:tblPr>
-        <w:tblW w:type="auto" w:w="0"/>
-        <w:tblLayout w:type="fixed"/>
-        <w:tblLook w:firstColumn="1" w:firstRow="1" w:lastColumn="0" w:lastRow="0" w:noHBand="0" w:noVBand="1" w:val="04A0"/>
-        <w:tblBorders>
-          <w:top w:val="single" w:sz="8" w:space="0" w:color="000000"/>
-          <w:left w:val="single" w:sz="8" w:space="0" w:color="000000"/>
-          <w:bottom w:val="single" w:sz="8" w:space="0" w:color="000000"/>
-          <w:right w:val="single" w:sz="8" w:space="0" w:color="000000"/>
-          <w:insideH w:val="single" w:sz="8" w:space="0" w:color="000000"/>
-          <w:insideV w:val="single" w:sz="8" w:space="0" w:color="000000"/>
-        </w:tblBorders>
-      </w:tblPr>
-      <w:tblGrid>
-        <w:gridCol w:w="2518"/>
-        <w:gridCol w:w="2518"/>
-        <w:gridCol w:w="2518"/>
-        <w:gridCol w:w="2518"/>
-        <w:gridCol w:w="2518"/>
-        <w:gridCol w:w="2518"/>
-      </w:tblGrid>
-      <w:tr>
-        <w:tc>
-          <w:tcPr>
-            <w:tcW w:type="dxa" w:w="504"/>
-            <w:vMerge w:val="restart"/>
-            <w:tcMar>
-              <w:top w:w="60" w:type="dxa"/>
-              <w:bottom w:w="60" w:type="dxa"/>
-              <w:left w:w="60" w:type="dxa"/>
-              <w:right w:w="60" w:type="dxa"/>
-            </w:tcMar>
-            <w:shd w:val="clear" w:color="auto" w:fill="FFF2CC"/>
-          </w:tcPr>
-          <w:p>
-            <w:pPr>
-              <w:spacing w:after="0" w:line="240" w:lineRule="auto"/>
-              <w:jc w:val="center"/>
-            </w:pPr>
-          </w:p>
-        </w:tc>
-        <w:tc>
-          <w:tcPr>
-            <w:tcW w:type="dxa" w:w="3168"/>
-            <w:vMerge w:val="restart"/>
-            <w:tcMar>
-              <w:top w:w="60" w:type="dxa"/>
-              <w:bottom w:w="60" w:type="dxa"/>
-              <w:left w:w="60" w:type="dxa"/>
-              <w:right w:w="60" w:type="dxa"/>
-            </w:tcMar>
-            <w:shd w:val="clear" w:color="auto" w:fill="FFF2CC"/>
-          </w:tcPr>
-          <w:p>
-            <w:pPr>
-              <w:spacing w:after="0" w:line="240" w:lineRule="auto"/>
-            </w:pPr>
-          </w:p>
-        </w:tc>
-        <w:tc>
-          <w:tcPr>
-            <w:tcW w:type="dxa" w:w="1008"/>
-            <w:gridSpan w:val="2"/>
-            <w:tcMar>
-              <w:top w:w="60" w:type="dxa"/>
-              <w:bottom w:w="60" w:type="dxa"/>
-              <w:left w:w="60" w:type="dxa"/>
-              <w:right w:w="60" w:type="dxa"/>
-            </w:tcMar>
-            <w:shd w:val="clear" w:color="auto" w:fill="D9E1F2"/>
-          </w:tcPr>
-          <w:p>
-            <w:pPr>
-              <w:spacing w:after="0" w:line="240" w:lineRule="auto"/>
-              <w:jc w:val="center"/>
-            </w:pPr>
-            <w:r>
-              <w:rPr>
-                <w:b/>
-                <w:sz w:val="15"/>
-              </w:rPr>
-              <w:t>Criterio 1: Reconoce si dos o mas fracciones representan la misma cantidad.</w:t>
-            </w:r>
-          </w:p>
-        </w:tc>
-        <w:tc>
-          <w:tcPr>
-            <w:tcW w:type="dxa" w:w="1008"/>
-            <w:gridSpan w:val="2"/>
-            <w:tcMar>
-              <w:top w:w="60" w:type="dxa"/>
-              <w:bottom w:w="60" w:type="dxa"/>
-              <w:left w:w="60" w:type="dxa"/>
-              <w:right w:w="60" w:type="dxa"/>
-            </w:tcMar>
-            <w:shd w:val="clear" w:color="auto" w:fill="FADBD8"/>
-          </w:tcPr>
-          <w:p>
-            <w:pPr>
-              <w:spacing w:after="0" w:line="240" w:lineRule="auto"/>
-              <w:jc w:val="center"/>
-            </w:pPr>
-            <w:r>
-              <w:rPr>
-                <w:b/>
-                <w:sz w:val="15"/>
-              </w:rPr>
-              <w:t>Criterio 2: Emplea estrategias de amplificacion/simplificacion.</w:t>
-            </w:r>
-          </w:p>
-        </w:tc>
-      </w:tr>
-      <w:tr>
-        <w:tc>
-          <w:tcPr>
-            <w:tcW w:type="dxa" w:w="2518"/>
-            <w:vMerge/>
-          </w:tcPr>
-          <w:p/>
-        </w:tc>
-        <w:tc>
-          <w:tcPr>
-            <w:tcW w:type="dxa" w:w="2518"/>
-            <w:vMerge/>
-          </w:tcPr>
-          <w:p/>
-        </w:tc>
-        <w:tc>
-          <w:tcPr>
-            <w:tcW w:type="dxa" w:w="504"/>
-            <w:tcMar>
-              <w:top w:w="60" w:type="dxa"/>
-              <w:bottom w:w="60" w:type="dxa"/>
-              <w:left w:w="60" w:type="dxa"/>
-              <w:right w:w="60" w:type="dxa"/>
-            </w:tcMar>
-            <w:shd w:val="clear" w:color="auto" w:fill="BDD7EE"/>
-          </w:tcPr>
-          <w:p>
-            <w:pPr>
-              <w:spacing w:after="0" w:line="240" w:lineRule="auto"/>
-              <w:jc w:val="center"/>
-            </w:pPr>
-            <w:r>
-              <w:rPr>
-                <w:b/>
-                <w:sz w:val="16"/>
-              </w:rPr>
-              <w:t>SI</w:t>
-            </w:r>
-          </w:p>
-        </w:tc>
-        <w:tc>
-          <w:tcPr>
-            <w:tcW w:type="dxa" w:w="504"/>
-            <w:tcMar>
-              <w:top w:w="60" w:type="dxa"/>
-              <w:bottom w:w="60" w:type="dxa"/>
-              <w:left w:w="60" w:type="dxa"/>
-              <w:right w:w="60" w:type="dxa"/>
-            </w:tcMar>
-            <w:shd w:val="clear" w:color="auto" w:fill="BDD7EE"/>
-          </w:tcPr>
-          <w:p>
-            <w:pPr>
-              <w:spacing w:after="0" w:line="240" w:lineRule="auto"/>
-              <w:jc w:val="center"/>
-            </w:pPr>
-            <w:r>
-              <w:rPr>
-                <w:b/>
-                <w:sz w:val="16"/>
-              </w:rPr>
-              <w:t>NO</w:t>
-            </w:r>
-          </w:p>
-        </w:tc>
-        <w:tc>
-          <w:tcPr>
-            <w:tcW w:type="dxa" w:w="504"/>
-            <w:tcMar>
-              <w:top w:w="60" w:type="dxa"/>
-              <w:bottom w:w="60" w:type="dxa"/>
-              <w:left w:w="60" w:type="dxa"/>
-              <w:right w:w="60" w:type="dxa"/>
-            </w:tcMar>
-            <w:shd w:val="clear" w:color="auto" w:fill="FADBD8"/>
-          </w:tcPr>
-          <w:p>
-            <w:pPr>
-              <w:spacing w:after="0" w:line="240" w:lineRule="auto"/>
-              <w:jc w:val="center"/>
-            </w:pPr>
-            <w:r>
-              <w:rPr>
-                <w:b/>
-                <w:sz w:val="16"/>
-              </w:rPr>
-              <w:t>SI</w:t>
-            </w:r>
-          </w:p>
-        </w:tc>
-        <w:tc>
-          <w:tcPr>
-            <w:tcW w:type="dxa" w:w="504"/>
-            <w:tcMar>
-              <w:top w:w="60" w:type="dxa"/>
-              <w:bottom w:w="60" w:type="dxa"/>
-              <w:left w:w="60" w:type="dxa"/>
-              <w:right w:w="60" w:type="dxa"/>
-            </w:tcMar>
-            <w:shd w:val="clear" w:color="auto" w:fill="FADBD8"/>
-          </w:tcPr>
-          <w:p>
-            <w:pPr>
-              <w:spacing w:after="0" w:line="240" w:lineRule="auto"/>
-              <w:jc w:val="center"/>
-            </w:pPr>
-            <w:r>
-              <w:rPr>
-                <w:b/>
-                <w:sz w:val="16"/>
-              </w:rPr>
-              <w:t>NO</w:t>
-            </w:r>
-          </w:p>
-        </w:tc>
-      </w:tr>
-      <w:tr>
-        <w:tc>
-          <w:tcPr>
-            <w:tcW w:type="dxa" w:w="504"/>
-            <w:tcMar>
-              <w:top w:w="60" w:type="dxa"/>
-              <w:bottom w:w="60" w:type="dxa"/>
-              <w:left w:w="60" w:type="dxa"/>
-              <w:right w:w="60" w:type="dxa"/>
-            </w:tcMar>
-          </w:tcPr>
-          <w:p>
-            <w:pPr>
-              <w:spacing w:after="0" w:line="240" w:lineRule="auto"/>
-              <w:jc w:val="center"/>
-            </w:pPr>
-            <w:r>
-              <w:rPr>
-                <w:b/>
-                <w:sz w:val="17"/>
-              </w:rPr>
-              <w:t>1</w:t>
-            </w:r>
-          </w:p>
-        </w:tc>
-        <w:tc>
-          <w:tcPr>
-            <w:tcW w:type="dxa" w:w="3168"/>
-            <w:tcMar>
-              <w:top w:w="60" w:type="dxa"/>
-              <w:bottom w:w="60" w:type="dxa"/>
-              <w:left w:w="60" w:type="dxa"/>
-              <w:right w:w="60" w:type="dxa"/>
-            </w:tcMar>
-          </w:tcPr>
-          <w:p>
-            <w:pPr>
-              <w:spacing w:after="0" w:line="240" w:lineRule="auto"/>
-            </w:pPr>
-            <w:r>
-              <w:rPr>
-                <w:b w:val="0"/>
-                <w:sz w:val="17"/>
-              </w:rPr>
-              <w:t>Gomez Prado, Ana Maria</w:t>
-            </w:r>
-          </w:p>
-        </w:tc>
-        <w:tc>
-          <w:tcPr>
-            <w:tcW w:type="dxa" w:w="504"/>
-            <w:tcMar>
-              <w:top w:w="60" w:type="dxa"/>
-              <w:bottom w:w="60" w:type="dxa"/>
-              <w:left w:w="60" w:type="dxa"/>
-              <w:right w:w="60" w:type="dxa"/>
-            </w:tcMar>
-          </w:tcPr>
-          <w:p>
-            <w:pPr>
-              <w:spacing w:after="0" w:line="240" w:lineRule="auto"/>
-              <w:jc w:val="center"/>
-            </w:pPr>
-          </w:p>
-        </w:tc>
-        <w:tc>
-          <w:tcPr>
-            <w:tcW w:type="dxa" w:w="504"/>
-            <w:tcMar>
-              <w:top w:w="60" w:type="dxa"/>
-              <w:bottom w:w="60" w:type="dxa"/>
-              <w:left w:w="60" w:type="dxa"/>
-              <w:right w:w="60" w:type="dxa"/>
-            </w:tcMar>
-          </w:tcPr>
-          <w:p>
-            <w:pPr>
-              <w:spacing w:after="0" w:line="240" w:lineRule="auto"/>
-              <w:jc w:val="center"/>
-            </w:pPr>
-          </w:p>
-        </w:tc>
-        <w:tc>
-          <w:tcPr>
-            <w:tcW w:type="dxa" w:w="504"/>
-            <w:tcMar>
-              <w:top w:w="60" w:type="dxa"/>
-              <w:bottom w:w="60" w:type="dxa"/>
-              <w:left w:w="60" w:type="dxa"/>
-              <w:right w:w="60" w:type="dxa"/>
-            </w:tcMar>
-          </w:tcPr>
-          <w:p>
-            <w:pPr>
-              <w:spacing w:after="0" w:line="240" w:lineRule="auto"/>
-              <w:jc w:val="center"/>
-            </w:pPr>
-          </w:p>
-        </w:tc>
-        <w:tc>
-          <w:tcPr>
-            <w:tcW w:type="dxa" w:w="504"/>
-            <w:tcMar>
-              <w:top w:w="60" w:type="dxa"/>
-              <w:bottom w:w="60" w:type="dxa"/>
-              <w:left w:w="60" w:type="dxa"/>
-              <w:right w:w="60" w:type="dxa"/>
-            </w:tcMar>
-          </w:tcPr>
-          <w:p>
-            <w:pPr>
-              <w:spacing w:after="0" w:line="240" w:lineRule="auto"/>
-              <w:jc w:val="center"/>
-            </w:pPr>
-          </w:p>
-        </w:tc>
-      </w:tr>
-      <w:tr>
-        <w:tc>
-          <w:tcPr>
-            <w:tcW w:type="dxa" w:w="504"/>
-            <w:tcMar>
-              <w:top w:w="60" w:type="dxa"/>
-              <w:bottom w:w="60" w:type="dxa"/>
-              <w:left w:w="60" w:type="dxa"/>
-              <w:right w:w="60" w:type="dxa"/>
-            </w:tcMar>
-          </w:tcPr>
-          <w:p>
-            <w:pPr>
-              <w:spacing w:after="0" w:line="240" w:lineRule="auto"/>
-              <w:jc w:val="center"/>
-            </w:pPr>
-            <w:r>
-              <w:rPr>
-                <w:b/>
-                <w:sz w:val="17"/>
-              </w:rPr>
-              <w:t>2</w:t>
-            </w:r>
-          </w:p>
-        </w:tc>
-        <w:tc>
-          <w:tcPr>
-            <w:tcW w:type="dxa" w:w="3168"/>
-            <w:tcMar>
-              <w:top w:w="60" w:type="dxa"/>
-              <w:bottom w:w="60" w:type="dxa"/>
-              <w:left w:w="60" w:type="dxa"/>
-              <w:right w:w="60" w:type="dxa"/>
-            </w:tcMar>
-          </w:tcPr>
-          <w:p>
-            <w:pPr>
-              <w:spacing w:after="0" w:line="240" w:lineRule="auto"/>
-            </w:pPr>
-            <w:r>
-              <w:rPr>
-                <w:b w:val="0"/>
-                <w:sz w:val="17"/>
-              </w:rPr>
-              <w:t>Quispe Mamani, Jose Luis</w:t>
-            </w:r>
-          </w:p>
-        </w:tc>
-        <w:tc>
-          <w:tcPr>
-            <w:tcW w:type="dxa" w:w="504"/>
-            <w:tcMar>
-              <w:top w:w="60" w:type="dxa"/>
-              <w:bottom w:w="60" w:type="dxa"/>
-              <w:left w:w="60" w:type="dxa"/>
-              <w:right w:w="60" w:type="dxa"/>
-            </w:tcMar>
-          </w:tcPr>
-          <w:p>
-            <w:pPr>
-              <w:spacing w:after="0" w:line="240" w:lineRule="auto"/>
-              <w:jc w:val="center"/>
-            </w:pPr>
-          </w:p>
-        </w:tc>
-        <w:tc>
-          <w:tcPr>
-            <w:tcW w:type="dxa" w:w="504"/>
-            <w:tcMar>
-              <w:top w:w="60" w:type="dxa"/>
-              <w:bottom w:w="60" w:type="dxa"/>
-              <w:left w:w="60" w:type="dxa"/>
-              <w:right w:w="60" w:type="dxa"/>
-            </w:tcMar>
-          </w:tcPr>
-          <w:p>
-            <w:pPr>
-              <w:spacing w:after="0" w:line="240" w:lineRule="auto"/>
-              <w:jc w:val="center"/>
-            </w:pPr>
-          </w:p>
-        </w:tc>
-        <w:tc>
-          <w:tcPr>
-            <w:tcW w:type="dxa" w:w="504"/>
-            <w:tcMar>
-              <w:top w:w="60" w:type="dxa"/>
-              <w:bottom w:w="60" w:type="dxa"/>
-              <w:left w:w="60" w:type="dxa"/>
-              <w:right w:w="60" w:type="dxa"/>
-            </w:tcMar>
-          </w:tcPr>
-          <w:p>
-            <w:pPr>
-              <w:spacing w:after="0" w:line="240" w:lineRule="auto"/>
-              <w:jc w:val="center"/>
-            </w:pPr>
-          </w:p>
-        </w:tc>
-        <w:tc>
-          <w:tcPr>
-            <w:tcW w:type="dxa" w:w="504"/>
-            <w:tcMar>
-              <w:top w:w="60" w:type="dxa"/>
-              <w:bottom w:w="60" w:type="dxa"/>
-              <w:left w:w="60" w:type="dxa"/>
-              <w:right w:w="60" w:type="dxa"/>
-            </w:tcMar>
-          </w:tcPr>
-          <w:p>
-            <w:pPr>
-              <w:spacing w:after="0" w:line="240" w:lineRule="auto"/>
-              <w:jc w:val="center"/>
-            </w:pPr>
-          </w:p>
-        </w:tc>
-      </w:tr>
-      <w:tr>
-        <w:tc>
-          <w:tcPr>
-            <w:tcW w:type="dxa" w:w="504"/>
-            <w:tcMar>
-              <w:top w:w="60" w:type="dxa"/>
-              <w:bottom w:w="60" w:type="dxa"/>
-              <w:left w:w="60" w:type="dxa"/>
-              <w:right w:w="60" w:type="dxa"/>
-            </w:tcMar>
-          </w:tcPr>
-          <w:p>
-            <w:pPr>
-              <w:spacing w:after="0" w:line="240" w:lineRule="auto"/>
-              <w:jc w:val="center"/>
-            </w:pPr>
-            <w:r>
-              <w:rPr>
-                <w:b/>
-                <w:sz w:val="17"/>
-              </w:rPr>
-              <w:t>3</w:t>
-            </w:r>
-          </w:p>
-        </w:tc>
-        <w:tc>
-          <w:tcPr>
-            <w:tcW w:type="dxa" w:w="3168"/>
-            <w:tcMar>
-              <w:top w:w="60" w:type="dxa"/>
-              <w:bottom w:w="60" w:type="dxa"/>
-              <w:left w:w="60" w:type="dxa"/>
-              <w:right w:w="60" w:type="dxa"/>
-            </w:tcMar>
-          </w:tcPr>
-          <w:p>
-            <w:pPr>
-              <w:spacing w:after="0" w:line="240" w:lineRule="auto"/>
-            </w:pPr>
-            <w:r>
-              <w:rPr>
-                <w:b w:val="0"/>
-                <w:sz w:val="17"/>
-              </w:rPr>
-              <w:t>Ruiz Diaz, Maria Julia</w:t>
-            </w:r>
-          </w:p>
-        </w:tc>
-        <w:tc>
-          <w:tcPr>
-            <w:tcW w:type="dxa" w:w="504"/>
-            <w:tcMar>
-              <w:top w:w="60" w:type="dxa"/>
-              <w:bottom w:w="60" w:type="dxa"/>
-              <w:left w:w="60" w:type="dxa"/>
-              <w:right w:w="60" w:type="dxa"/>
-            </w:tcMar>
-          </w:tcPr>
-          <w:p>
-            <w:pPr>
-              <w:spacing w:after="0" w:line="240" w:lineRule="auto"/>
-              <w:jc w:val="center"/>
-            </w:pPr>
-          </w:p>
-        </w:tc>
-        <w:tc>
-          <w:tcPr>
-            <w:tcW w:type="dxa" w:w="504"/>
-            <w:tcMar>
-              <w:top w:w="60" w:type="dxa"/>
-              <w:bottom w:w="60" w:type="dxa"/>
-              <w:left w:w="60" w:type="dxa"/>
-              <w:right w:w="60" w:type="dxa"/>
-            </w:tcMar>
-          </w:tcPr>
-          <w:p>
-            <w:pPr>
-              <w:spacing w:after="0" w:line="240" w:lineRule="auto"/>
-              <w:jc w:val="center"/>
-            </w:pPr>
-          </w:p>
-        </w:tc>
-        <w:tc>
-          <w:tcPr>
-            <w:tcW w:type="dxa" w:w="504"/>
-            <w:tcMar>
-              <w:top w:w="60" w:type="dxa"/>
-              <w:bottom w:w="60" w:type="dxa"/>
-              <w:left w:w="60" w:type="dxa"/>
-              <w:right w:w="60" w:type="dxa"/>
-            </w:tcMar>
-          </w:tcPr>
-          <w:p>
-            <w:pPr>
-              <w:spacing w:after="0" w:line="240" w:lineRule="auto"/>
-              <w:jc w:val="center"/>
-            </w:pPr>
-          </w:p>
-        </w:tc>
-        <w:tc>
-          <w:tcPr>
-            <w:tcW w:type="dxa" w:w="504"/>
-            <w:tcMar>
-              <w:top w:w="60" w:type="dxa"/>
-              <w:bottom w:w="60" w:type="dxa"/>
-              <w:left w:w="60" w:type="dxa"/>
-              <w:right w:w="60" w:type="dxa"/>
-            </w:tcMar>
-          </w:tcPr>
-          <w:p>
-            <w:pPr>
-              <w:spacing w:after="0" w:line="240" w:lineRule="auto"/>
-              <w:jc w:val="center"/>
-            </w:pPr>
-          </w:p>
-        </w:tc>
-      </w:tr>
-    </w:tbl>
     <w:sectPr>
-      <w:pgSz w:w="16834" w:h="11909"/>
-      <w:pgMar w:top="864" w:right="864" w:bottom="864" w:left="864" w:header="720" w:footer="720" w:gutter="0"/>
+      <w:headerReference w:type="default" r:id="rId9"/>
+      <w:pgSz w:w="11909" w:h="16834"/>
+      <w:pgMar w:top="144" w:right="1080" w:bottom="144" w:left="1080" w:header="720" w:footer="720" w:gutter="0"/>
       <w:cols w:space="720"/>
       <w:docGrid w:linePitch="360"/>
     </w:sectPr>
@@ -3744,12 +2613,38 @@
             <w:jc w:val="center"/>
           </w:pPr>
           <w:r>
-            <w:rPr>
-              <w:b/>
-              <w:color w:val="C00000"/>
-              <w:sz w:val="18"/>
-            </w:rPr>
-            <w:t>PERÚ</w:t>
+            <w:drawing>
+              <wp:inline xmlns:a="http://schemas.openxmlformats.org/drawingml/2006/main" xmlns:pic="http://schemas.openxmlformats.org/drawingml/2006/picture">
+                <wp:extent cx="548640" cy="548640"/>
+                <wp:docPr id="1" name="Picture 1"/>
+                <wp:cNvGraphicFramePr>
+                  <a:graphicFrameLocks noChangeAspect="1"/>
+                </wp:cNvGraphicFramePr>
+                <a:graphic>
+                  <a:graphicData uri="http://schemas.openxmlformats.org/drawingml/2006/picture">
+                    <pic:pic>
+                      <pic:nvPicPr>
+                        <pic:cNvPr id="0" name="image.png"/>
+                        <pic:cNvPicPr/>
+                      </pic:nvPicPr>
+                      <pic:blipFill>
+                        <a:blip r:embed="rId1"/>
+                        <a:stretch>
+                          <a:fillRect/>
+                        </a:stretch>
+                      </pic:blipFill>
+                      <pic:spPr>
+                        <a:xfrm>
+                          <a:off x="0" y="0"/>
+                          <a:ext cx="548640" cy="548640"/>
+                        </a:xfrm>
+                        <a:prstGeom prst="rect"/>
+                      </pic:spPr>
+                    </pic:pic>
+                  </a:graphicData>
+                </a:graphic>
+              </wp:inline>
+            </w:drawing>
           </w:r>
         </w:p>
       </w:tc>
@@ -3988,10 +2883,38 @@
             <w:jc w:val="center"/>
           </w:pPr>
           <w:r>
-            <w:rPr>
-              <w:sz w:val="36"/>
-            </w:rPr>
-            <w:t>🏫</w:t>
+            <w:drawing>
+              <wp:inline xmlns:a="http://schemas.openxmlformats.org/drawingml/2006/main" xmlns:pic="http://schemas.openxmlformats.org/drawingml/2006/picture">
+                <wp:extent cx="548640" cy="548640"/>
+                <wp:docPr id="2" name="Picture 2"/>
+                <wp:cNvGraphicFramePr>
+                  <a:graphicFrameLocks noChangeAspect="1"/>
+                </wp:cNvGraphicFramePr>
+                <a:graphic>
+                  <a:graphicData uri="http://schemas.openxmlformats.org/drawingml/2006/picture">
+                    <pic:pic>
+                      <pic:nvPicPr>
+                        <pic:cNvPr id="0" name="image.png"/>
+                        <pic:cNvPicPr/>
+                      </pic:nvPicPr>
+                      <pic:blipFill>
+                        <a:blip r:embed="rId1"/>
+                        <a:stretch>
+                          <a:fillRect/>
+                        </a:stretch>
+                      </pic:blipFill>
+                      <pic:spPr>
+                        <a:xfrm>
+                          <a:off x="0" y="0"/>
+                          <a:ext cx="548640" cy="548640"/>
+                        </a:xfrm>
+                        <a:prstGeom prst="rect"/>
+                      </pic:spPr>
+                    </pic:pic>
+                  </a:graphicData>
+                </a:graphic>
+              </wp:inline>
+            </w:drawing>
           </w:r>
         </w:p>
       </w:tc>

</xml_diff>